<commit_message>
fix: correct invalid OOXML settings.xml element order in Solution_Walkthrough.docx
w:updateFields was appended at the end of settings.xml, after w:compat,
w:rsids, w:mathPr, etc. CT_Settings requires a fixed element sequence
where w:updateFields comes immediately before w:compat; Word silently
tolerates the wrong order, but GitHub's docx preview (and other strict
OOXML renderers) refused to open the file. Also switched the page-number
and TOC field codes to Word's own convention of one run per field-code
part (begin/instrText/separate/end) instead of packing them into a
single run, as an additional compatibility safeguard.

Co-Authored-By: Claude Sonnet 5 <noreply@anthropic.com>
Claude-Session: https://claude.ai/code/session_01FrVtARfGbPZyTjZCoaVagU
</commit_message>
<xml_diff>
--- a/Solution_Walkthrough.docx
+++ b/Solution_Walkthrough.docx
@@ -97,10 +97,17 @@
     <w:p>
       <w:r>
         <w:fldChar w:fldCharType="begin"/>
+      </w:r>
+      <w:r>
         <w:instrText xml:space="preserve">TOC \o "1-2" \h \z \u</w:instrText>
-        <w:fldChar w:fldCharType="separate">
-          <w:t>Right-click here and choose “Update Field” to generate the table of contents.</w:t>
-        </w:fldChar>
+      </w:r>
+      <w:r>
+        <w:fldChar w:fldCharType="separate"/>
+      </w:r>
+      <w:r>
+        <w:t>Right-click here and choose “Update Field” to generate the table of contents.</w:t>
+      </w:r>
+      <w:r>
         <w:fldChar w:fldCharType="end"/>
       </w:r>
     </w:p>
@@ -3681,7 +3688,17 @@
     </w:pPr>
     <w:r>
       <w:fldChar w:fldCharType="begin"/>
+    </w:r>
+    <w:r>
       <w:instrText xml:space="preserve">PAGE</w:instrText>
+    </w:r>
+    <w:r>
+      <w:fldChar w:fldCharType="separate"/>
+    </w:r>
+    <w:r>
+      <w:t>1</w:t>
+    </w:r>
+    <w:r>
       <w:fldChar w:fldCharType="end"/>
     </w:r>
   </w:p>

</xml_diff>